<commit_message>
Agrega enlaces directos en tabla de anexos
</commit_message>
<xml_diff>
--- a/entregables/TFI_departamentos_final_anexos.docx
+++ b/entregables/TFI_departamentos_final_anexos.docx
@@ -26533,13 +26533,17 @@
             <w:pPr>
               <w:spacing w:before="60" w:after="60" w:line="264" w:lineRule="auto"/>
             </w:pPr>
-            <w:r>
-              <w:rPr>
-                <w:rFonts w:ascii="Times New Roman" w:hAnsi="Times New Roman"/>
-                <w:sz w:val="21"/>
-              </w:rPr>
-              <w:t>DATA_MODELING/01_EDA.ipynb</w:t>
-            </w:r>
+            <w:hyperlink r:id="rId40">
+              <w:r>
+                <w:rPr>
+                  <w:rFonts w:ascii="Times New Roman" w:hAnsi="Times New Roman"/>
+                  <w:sz w:val="21"/>
+                  <w:color w:val="0563C1"/>
+                  <w:u w:val="single"/>
+                </w:rPr>
+                <w:t>DATA_MODELING/01_EDA.ipynb</w:t>
+              </w:r>
+            </w:hyperlink>
           </w:p>
         </w:tc>
         <w:tc>
@@ -26596,13 +26600,17 @@
             <w:pPr>
               <w:spacing w:before="60" w:after="60" w:line="264" w:lineRule="auto"/>
             </w:pPr>
-            <w:r>
-              <w:rPr>
-                <w:rFonts w:ascii="Times New Roman" w:hAnsi="Times New Roman"/>
-                <w:sz w:val="21"/>
-              </w:rPr>
-              <w:t>data/mitula_venta_mar_del_plata_SC.xlsx</w:t>
-            </w:r>
+            <w:hyperlink r:id="rId41">
+              <w:r>
+                <w:rPr>
+                  <w:rFonts w:ascii="Times New Roman" w:hAnsi="Times New Roman"/>
+                  <w:sz w:val="21"/>
+                  <w:color w:val="0563C1"/>
+                  <w:u w:val="single"/>
+                </w:rPr>
+                <w:t>data/mitula_venta_mar_del_plata_SC.xlsx</w:t>
+              </w:r>
+            </w:hyperlink>
           </w:p>
         </w:tc>
         <w:tc>
@@ -26659,13 +26667,17 @@
             <w:pPr>
               <w:spacing w:before="60" w:after="60" w:line="264" w:lineRule="auto"/>
             </w:pPr>
-            <w:r>
-              <w:rPr>
-                <w:rFonts w:ascii="Times New Roman" w:hAnsi="Times New Roman"/>
-                <w:sz w:val="21"/>
-              </w:rPr>
-              <w:t>data/correcciones_avisos.json</w:t>
-            </w:r>
+            <w:hyperlink r:id="rId42">
+              <w:r>
+                <w:rPr>
+                  <w:rFonts w:ascii="Times New Roman" w:hAnsi="Times New Roman"/>
+                  <w:sz w:val="21"/>
+                  <w:color w:val="0563C1"/>
+                  <w:u w:val="single"/>
+                </w:rPr>
+                <w:t>data/correcciones_avisos.json</w:t>
+              </w:r>
+            </w:hyperlink>
           </w:p>
         </w:tc>
         <w:tc>
@@ -26722,13 +26734,17 @@
             <w:pPr>
               <w:spacing w:before="60" w:after="60" w:line="264" w:lineRule="auto"/>
             </w:pPr>
-            <w:r>
-              <w:rPr>
-                <w:rFonts w:ascii="Times New Roman" w:hAnsi="Times New Roman"/>
-                <w:sz w:val="21"/>
-              </w:rPr>
-              <w:t>data/barrios_mar_del_plata.geojson</w:t>
-            </w:r>
+            <w:hyperlink r:id="rId43">
+              <w:r>
+                <w:rPr>
+                  <w:rFonts w:ascii="Times New Roman" w:hAnsi="Times New Roman"/>
+                  <w:sz w:val="21"/>
+                  <w:color w:val="0563C1"/>
+                  <w:u w:val="single"/>
+                </w:rPr>
+                <w:t>data/barrios_mar_del_plata.geojson</w:t>
+              </w:r>
+            </w:hyperlink>
           </w:p>
         </w:tc>
         <w:tc>
@@ -26785,13 +26801,17 @@
             <w:pPr>
               <w:spacing w:before="60" w:after="60" w:line="264" w:lineRule="auto"/>
             </w:pPr>
-            <w:r>
-              <w:rPr>
-                <w:rFonts w:ascii="Times New Roman" w:hAnsi="Times New Roman"/>
-                <w:sz w:val="21"/>
-              </w:rPr>
-              <w:t>data/costa_mar_del_plata.geojson</w:t>
-            </w:r>
+            <w:hyperlink r:id="rId44">
+              <w:r>
+                <w:rPr>
+                  <w:rFonts w:ascii="Times New Roman" w:hAnsi="Times New Roman"/>
+                  <w:sz w:val="21"/>
+                  <w:color w:val="0563C1"/>
+                  <w:u w:val="single"/>
+                </w:rPr>
+                <w:t>data/costa_mar_del_plata.geojson</w:t>
+              </w:r>
+            </w:hyperlink>
           </w:p>
         </w:tc>
         <w:tc>
@@ -26848,13 +26868,17 @@
             <w:pPr>
               <w:spacing w:before="60" w:after="60" w:line="264" w:lineRule="auto"/>
             </w:pPr>
-            <w:r>
-              <w:rPr>
-                <w:rFonts w:ascii="Times New Roman" w:hAnsi="Times New Roman"/>
-                <w:sz w:val="21"/>
-              </w:rPr>
-              <w:t>data/mitula_departamentos_final.xlsx</w:t>
-            </w:r>
+            <w:hyperlink r:id="rId45">
+              <w:r>
+                <w:rPr>
+                  <w:rFonts w:ascii="Times New Roman" w:hAnsi="Times New Roman"/>
+                  <w:sz w:val="21"/>
+                  <w:color w:val="0563C1"/>
+                  <w:u w:val="single"/>
+                </w:rPr>
+                <w:t>data/mitula_departamentos_final.xlsx</w:t>
+              </w:r>
+            </w:hyperlink>
           </w:p>
         </w:tc>
         <w:tc>
@@ -26911,13 +26935,17 @@
             <w:pPr>
               <w:spacing w:before="60" w:after="60" w:line="264" w:lineRule="auto"/>
             </w:pPr>
-            <w:r>
-              <w:rPr>
-                <w:rFonts w:ascii="Times New Roman" w:hAnsi="Times New Roman"/>
-                <w:sz w:val="21"/>
-              </w:rPr>
-              <w:t>DATA_MODELING/pycaret_complementario.py</w:t>
-            </w:r>
+            <w:hyperlink r:id="rId46">
+              <w:r>
+                <w:rPr>
+                  <w:rFonts w:ascii="Times New Roman" w:hAnsi="Times New Roman"/>
+                  <w:sz w:val="21"/>
+                  <w:color w:val="0563C1"/>
+                  <w:u w:val="single"/>
+                </w:rPr>
+                <w:t>DATA_MODELING/pycaret_complementario.py</w:t>
+              </w:r>
+            </w:hyperlink>
           </w:p>
         </w:tc>
         <w:tc>
@@ -26974,13 +27002,17 @@
             <w:pPr>
               <w:spacing w:before="60" w:after="60" w:line="264" w:lineRule="auto"/>
             </w:pPr>
-            <w:r>
-              <w:rPr>
-                <w:rFonts w:ascii="Times New Roman" w:hAnsi="Times New Roman"/>
-                <w:sz w:val="21"/>
-              </w:rPr>
-              <w:t>DATA_MODELING/reportes/pycaret</w:t>
-            </w:r>
+            <w:hyperlink r:id="rId47">
+              <w:r>
+                <w:rPr>
+                  <w:rFonts w:ascii="Times New Roman" w:hAnsi="Times New Roman"/>
+                  <w:sz w:val="21"/>
+                  <w:color w:val="0563C1"/>
+                  <w:u w:val="single"/>
+                </w:rPr>
+                <w:t>DATA_MODELING/reportes/pycaret</w:t>
+              </w:r>
+            </w:hyperlink>
           </w:p>
         </w:tc>
         <w:tc>

</xml_diff>

<commit_message>
Actualiza cierre de conclusiones del TFI
</commit_message>
<xml_diff>
--- a/entregables/TFI_departamentos_final_anexos.docx
+++ b/entregables/TFI_departamentos_final_anexos.docx
@@ -414,7 +414,7 @@
       <w:r>
         <w:fldChar w:fldCharType="separate"/>
       </w:r>
-      <w:hyperlink w:anchor="_Toc244354649" w:history="1">
+      <w:hyperlink w:anchor="_Toc244354956" w:history="1">
         <w:r>
           <w:rPr>
             <w:rStyle w:val="Hipervnculo"/>
@@ -441,7 +441,7 @@
             <w:noProof/>
             <w:webHidden/>
           </w:rPr>
-          <w:instrText xml:space="preserve"> PAGEREF _Toc244354649 \h </w:instrText>
+          <w:instrText xml:space="preserve"> PAGEREF _Toc244354956 \h </w:instrText>
         </w:r>
         <w:r>
           <w:rPr>
@@ -487,7 +487,7 @@
           <w14:ligatures w14:val="standardContextual"/>
         </w:rPr>
       </w:pPr>
-      <w:hyperlink w:anchor="_Toc244354650" w:history="1">
+      <w:hyperlink w:anchor="_Toc244354957" w:history="1">
         <w:r>
           <w:rPr>
             <w:rStyle w:val="Hipervnculo"/>
@@ -514,7 +514,7 @@
             <w:noProof/>
             <w:webHidden/>
           </w:rPr>
-          <w:instrText xml:space="preserve"> PAGEREF _Toc244354650 \h </w:instrText>
+          <w:instrText xml:space="preserve"> PAGEREF _Toc244354957 \h </w:instrText>
         </w:r>
         <w:r>
           <w:rPr>
@@ -560,7 +560,7 @@
           <w14:ligatures w14:val="standardContextual"/>
         </w:rPr>
       </w:pPr>
-      <w:hyperlink w:anchor="_Toc244354651" w:history="1">
+      <w:hyperlink w:anchor="_Toc244354958" w:history="1">
         <w:r>
           <w:rPr>
             <w:rStyle w:val="Hipervnculo"/>
@@ -587,7 +587,7 @@
             <w:noProof/>
             <w:webHidden/>
           </w:rPr>
-          <w:instrText xml:space="preserve"> PAGEREF _Toc244354651 \h </w:instrText>
+          <w:instrText xml:space="preserve"> PAGEREF _Toc244354958 \h </w:instrText>
         </w:r>
         <w:r>
           <w:rPr>
@@ -633,7 +633,7 @@
           <w14:ligatures w14:val="standardContextual"/>
         </w:rPr>
       </w:pPr>
-      <w:hyperlink w:anchor="_Toc244354652" w:history="1">
+      <w:hyperlink w:anchor="_Toc244354959" w:history="1">
         <w:r>
           <w:rPr>
             <w:rStyle w:val="Hipervnculo"/>
@@ -660,7 +660,7 @@
             <w:noProof/>
             <w:webHidden/>
           </w:rPr>
-          <w:instrText xml:space="preserve"> PAGEREF _Toc244354652 \h </w:instrText>
+          <w:instrText xml:space="preserve"> PAGEREF _Toc244354959 \h </w:instrText>
         </w:r>
         <w:r>
           <w:rPr>
@@ -706,7 +706,7 @@
           <w14:ligatures w14:val="standardContextual"/>
         </w:rPr>
       </w:pPr>
-      <w:hyperlink w:anchor="_Toc244354653" w:history="1">
+      <w:hyperlink w:anchor="_Toc244354960" w:history="1">
         <w:r>
           <w:rPr>
             <w:rStyle w:val="Hipervnculo"/>
@@ -733,7 +733,7 @@
             <w:noProof/>
             <w:webHidden/>
           </w:rPr>
-          <w:instrText xml:space="preserve"> PAGEREF _Toc244354653 \h </w:instrText>
+          <w:instrText xml:space="preserve"> PAGEREF _Toc244354960 \h </w:instrText>
         </w:r>
         <w:r>
           <w:rPr>
@@ -779,7 +779,7 @@
           <w14:ligatures w14:val="standardContextual"/>
         </w:rPr>
       </w:pPr>
-      <w:hyperlink w:anchor="_Toc244354654" w:history="1">
+      <w:hyperlink w:anchor="_Toc244354961" w:history="1">
         <w:r>
           <w:rPr>
             <w:rStyle w:val="Hipervnculo"/>
@@ -806,7 +806,7 @@
             <w:noProof/>
             <w:webHidden/>
           </w:rPr>
-          <w:instrText xml:space="preserve"> PAGEREF _Toc244354654 \h </w:instrText>
+          <w:instrText xml:space="preserve"> PAGEREF _Toc244354961 \h </w:instrText>
         </w:r>
         <w:r>
           <w:rPr>
@@ -852,7 +852,7 @@
           <w14:ligatures w14:val="standardContextual"/>
         </w:rPr>
       </w:pPr>
-      <w:hyperlink w:anchor="_Toc244354655" w:history="1">
+      <w:hyperlink w:anchor="_Toc244354962" w:history="1">
         <w:r>
           <w:rPr>
             <w:rStyle w:val="Hipervnculo"/>
@@ -879,7 +879,7 @@
             <w:noProof/>
             <w:webHidden/>
           </w:rPr>
-          <w:instrText xml:space="preserve"> PAGEREF _Toc244354655 \h </w:instrText>
+          <w:instrText xml:space="preserve"> PAGEREF _Toc244354962 \h </w:instrText>
         </w:r>
         <w:r>
           <w:rPr>
@@ -925,7 +925,7 @@
           <w14:ligatures w14:val="standardContextual"/>
         </w:rPr>
       </w:pPr>
-      <w:hyperlink w:anchor="_Toc244354656" w:history="1">
+      <w:hyperlink w:anchor="_Toc244354963" w:history="1">
         <w:r>
           <w:rPr>
             <w:rStyle w:val="Hipervnculo"/>
@@ -952,7 +952,7 @@
             <w:noProof/>
             <w:webHidden/>
           </w:rPr>
-          <w:instrText xml:space="preserve"> PAGEREF _Toc244354656 \h </w:instrText>
+          <w:instrText xml:space="preserve"> PAGEREF _Toc244354963 \h </w:instrText>
         </w:r>
         <w:r>
           <w:rPr>
@@ -998,7 +998,7 @@
           <w14:ligatures w14:val="standardContextual"/>
         </w:rPr>
       </w:pPr>
-      <w:hyperlink w:anchor="_Toc244354657" w:history="1">
+      <w:hyperlink w:anchor="_Toc244354964" w:history="1">
         <w:r>
           <w:rPr>
             <w:rStyle w:val="Hipervnculo"/>
@@ -1025,7 +1025,7 @@
             <w:noProof/>
             <w:webHidden/>
           </w:rPr>
-          <w:instrText xml:space="preserve"> PAGEREF _Toc244354657 \h </w:instrText>
+          <w:instrText xml:space="preserve"> PAGEREF _Toc244354964 \h </w:instrText>
         </w:r>
         <w:r>
           <w:rPr>
@@ -1071,7 +1071,7 @@
           <w14:ligatures w14:val="standardContextual"/>
         </w:rPr>
       </w:pPr>
-      <w:hyperlink w:anchor="_Toc244354658" w:history="1">
+      <w:hyperlink w:anchor="_Toc244354965" w:history="1">
         <w:r>
           <w:rPr>
             <w:rStyle w:val="Hipervnculo"/>
@@ -1098,7 +1098,7 @@
             <w:noProof/>
             <w:webHidden/>
           </w:rPr>
-          <w:instrText xml:space="preserve"> PAGEREF _Toc244354658 \h </w:instrText>
+          <w:instrText xml:space="preserve"> PAGEREF _Toc244354965 \h </w:instrText>
         </w:r>
         <w:r>
           <w:rPr>
@@ -1144,7 +1144,7 @@
           <w14:ligatures w14:val="standardContextual"/>
         </w:rPr>
       </w:pPr>
-      <w:hyperlink w:anchor="_Toc244354659" w:history="1">
+      <w:hyperlink w:anchor="_Toc244354966" w:history="1">
         <w:r>
           <w:rPr>
             <w:rStyle w:val="Hipervnculo"/>
@@ -1171,7 +1171,7 @@
             <w:noProof/>
             <w:webHidden/>
           </w:rPr>
-          <w:instrText xml:space="preserve"> PAGEREF _Toc244354659 \h </w:instrText>
+          <w:instrText xml:space="preserve"> PAGEREF _Toc244354966 \h </w:instrText>
         </w:r>
         <w:r>
           <w:rPr>
@@ -1217,7 +1217,7 @@
           <w14:ligatures w14:val="standardContextual"/>
         </w:rPr>
       </w:pPr>
-      <w:hyperlink w:anchor="_Toc244354660" w:history="1">
+      <w:hyperlink w:anchor="_Toc244354967" w:history="1">
         <w:r>
           <w:rPr>
             <w:rStyle w:val="Hipervnculo"/>
@@ -1244,7 +1244,7 @@
             <w:noProof/>
             <w:webHidden/>
           </w:rPr>
-          <w:instrText xml:space="preserve"> PAGEREF _Toc244354660 \h </w:instrText>
+          <w:instrText xml:space="preserve"> PAGEREF _Toc244354967 \h </w:instrText>
         </w:r>
         <w:r>
           <w:rPr>
@@ -1290,7 +1290,7 @@
           <w14:ligatures w14:val="standardContextual"/>
         </w:rPr>
       </w:pPr>
-      <w:hyperlink w:anchor="_Toc244354661" w:history="1">
+      <w:hyperlink w:anchor="_Toc244354968" w:history="1">
         <w:r>
           <w:rPr>
             <w:rStyle w:val="Hipervnculo"/>
@@ -1317,7 +1317,7 @@
             <w:noProof/>
             <w:webHidden/>
           </w:rPr>
-          <w:instrText xml:space="preserve"> PAGEREF _Toc244354661 \h </w:instrText>
+          <w:instrText xml:space="preserve"> PAGEREF _Toc244354968 \h </w:instrText>
         </w:r>
         <w:r>
           <w:rPr>
@@ -1363,7 +1363,7 @@
           <w14:ligatures w14:val="standardContextual"/>
         </w:rPr>
       </w:pPr>
-      <w:hyperlink w:anchor="_Toc244354662" w:history="1">
+      <w:hyperlink w:anchor="_Toc244354969" w:history="1">
         <w:r>
           <w:rPr>
             <w:rStyle w:val="Hipervnculo"/>
@@ -1390,7 +1390,7 @@
             <w:noProof/>
             <w:webHidden/>
           </w:rPr>
-          <w:instrText xml:space="preserve"> PAGEREF _Toc244354662 \h </w:instrText>
+          <w:instrText xml:space="preserve"> PAGEREF _Toc244354969 \h </w:instrText>
         </w:r>
         <w:r>
           <w:rPr>
@@ -1436,7 +1436,7 @@
           <w14:ligatures w14:val="standardContextual"/>
         </w:rPr>
       </w:pPr>
-      <w:hyperlink w:anchor="_Toc244354663" w:history="1">
+      <w:hyperlink w:anchor="_Toc244354970" w:history="1">
         <w:r>
           <w:rPr>
             <w:rStyle w:val="Hipervnculo"/>
@@ -1463,7 +1463,7 @@
             <w:noProof/>
             <w:webHidden/>
           </w:rPr>
-          <w:instrText xml:space="preserve"> PAGEREF _Toc244354663 \h </w:instrText>
+          <w:instrText xml:space="preserve"> PAGEREF _Toc244354970 \h </w:instrText>
         </w:r>
         <w:r>
           <w:rPr>
@@ -1509,7 +1509,7 @@
           <w14:ligatures w14:val="standardContextual"/>
         </w:rPr>
       </w:pPr>
-      <w:hyperlink w:anchor="_Toc244354664" w:history="1">
+      <w:hyperlink w:anchor="_Toc244354971" w:history="1">
         <w:r>
           <w:rPr>
             <w:rStyle w:val="Hipervnculo"/>
@@ -1536,7 +1536,7 @@
             <w:noProof/>
             <w:webHidden/>
           </w:rPr>
-          <w:instrText xml:space="preserve"> PAGEREF _Toc244354664 \h </w:instrText>
+          <w:instrText xml:space="preserve"> PAGEREF _Toc244354971 \h </w:instrText>
         </w:r>
         <w:r>
           <w:rPr>
@@ -1582,7 +1582,7 @@
           <w14:ligatures w14:val="standardContextual"/>
         </w:rPr>
       </w:pPr>
-      <w:hyperlink w:anchor="_Toc244354665" w:history="1">
+      <w:hyperlink w:anchor="_Toc244354972" w:history="1">
         <w:r>
           <w:rPr>
             <w:rStyle w:val="Hipervnculo"/>
@@ -1609,7 +1609,7 @@
             <w:noProof/>
             <w:webHidden/>
           </w:rPr>
-          <w:instrText xml:space="preserve"> PAGEREF _Toc244354665 \h </w:instrText>
+          <w:instrText xml:space="preserve"> PAGEREF _Toc244354972 \h </w:instrText>
         </w:r>
         <w:r>
           <w:rPr>
@@ -1655,7 +1655,7 @@
           <w14:ligatures w14:val="standardContextual"/>
         </w:rPr>
       </w:pPr>
-      <w:hyperlink w:anchor="_Toc244354666" w:history="1">
+      <w:hyperlink w:anchor="_Toc244354973" w:history="1">
         <w:r>
           <w:rPr>
             <w:rStyle w:val="Hipervnculo"/>
@@ -1682,7 +1682,7 @@
             <w:noProof/>
             <w:webHidden/>
           </w:rPr>
-          <w:instrText xml:space="preserve"> PAGEREF _Toc244354666 \h </w:instrText>
+          <w:instrText xml:space="preserve"> PAGEREF _Toc244354973 \h </w:instrText>
         </w:r>
         <w:r>
           <w:rPr>
@@ -1728,7 +1728,7 @@
           <w14:ligatures w14:val="standardContextual"/>
         </w:rPr>
       </w:pPr>
-      <w:hyperlink w:anchor="_Toc244354667" w:history="1">
+      <w:hyperlink w:anchor="_Toc244354974" w:history="1">
         <w:r>
           <w:rPr>
             <w:rStyle w:val="Hipervnculo"/>
@@ -1755,7 +1755,7 @@
             <w:noProof/>
             <w:webHidden/>
           </w:rPr>
-          <w:instrText xml:space="preserve"> PAGEREF _Toc244354667 \h </w:instrText>
+          <w:instrText xml:space="preserve"> PAGEREF _Toc244354974 \h </w:instrText>
         </w:r>
         <w:r>
           <w:rPr>
@@ -1801,7 +1801,7 @@
           <w14:ligatures w14:val="standardContextual"/>
         </w:rPr>
       </w:pPr>
-      <w:hyperlink w:anchor="_Toc244354668" w:history="1">
+      <w:hyperlink w:anchor="_Toc244354975" w:history="1">
         <w:r>
           <w:rPr>
             <w:rStyle w:val="Hipervnculo"/>
@@ -1828,7 +1828,7 @@
             <w:noProof/>
             <w:webHidden/>
           </w:rPr>
-          <w:instrText xml:space="preserve"> PAGEREF _Toc244354668 \h </w:instrText>
+          <w:instrText xml:space="preserve"> PAGEREF _Toc244354975 \h </w:instrText>
         </w:r>
         <w:r>
           <w:rPr>
@@ -1874,7 +1874,7 @@
           <w14:ligatures w14:val="standardContextual"/>
         </w:rPr>
       </w:pPr>
-      <w:hyperlink w:anchor="_Toc244354669" w:history="1">
+      <w:hyperlink w:anchor="_Toc244354976" w:history="1">
         <w:r>
           <w:rPr>
             <w:rStyle w:val="Hipervnculo"/>
@@ -1901,7 +1901,7 @@
             <w:noProof/>
             <w:webHidden/>
           </w:rPr>
-          <w:instrText xml:space="preserve"> PAGEREF _Toc244354669 \h </w:instrText>
+          <w:instrText xml:space="preserve"> PAGEREF _Toc244354976 \h </w:instrText>
         </w:r>
         <w:r>
           <w:rPr>
@@ -1947,7 +1947,7 @@
           <w14:ligatures w14:val="standardContextual"/>
         </w:rPr>
       </w:pPr>
-      <w:hyperlink w:anchor="_Toc244354670" w:history="1">
+      <w:hyperlink w:anchor="_Toc244354977" w:history="1">
         <w:r>
           <w:rPr>
             <w:rStyle w:val="Hipervnculo"/>
@@ -1974,7 +1974,7 @@
             <w:noProof/>
             <w:webHidden/>
           </w:rPr>
-          <w:instrText xml:space="preserve"> PAGEREF _Toc244354670 \h </w:instrText>
+          <w:instrText xml:space="preserve"> PAGEREF _Toc244354977 \h </w:instrText>
         </w:r>
         <w:r>
           <w:rPr>
@@ -2020,7 +2020,7 @@
           <w14:ligatures w14:val="standardContextual"/>
         </w:rPr>
       </w:pPr>
-      <w:hyperlink w:anchor="_Toc244354671" w:history="1">
+      <w:hyperlink w:anchor="_Toc244354978" w:history="1">
         <w:r>
           <w:rPr>
             <w:rStyle w:val="Hipervnculo"/>
@@ -2047,7 +2047,7 @@
             <w:noProof/>
             <w:webHidden/>
           </w:rPr>
-          <w:instrText xml:space="preserve"> PAGEREF _Toc244354671 \h </w:instrText>
+          <w:instrText xml:space="preserve"> PAGEREF _Toc244354978 \h </w:instrText>
         </w:r>
         <w:r>
           <w:rPr>
@@ -2093,7 +2093,7 @@
           <w14:ligatures w14:val="standardContextual"/>
         </w:rPr>
       </w:pPr>
-      <w:hyperlink w:anchor="_Toc244354672" w:history="1">
+      <w:hyperlink w:anchor="_Toc244354979" w:history="1">
         <w:r>
           <w:rPr>
             <w:rStyle w:val="Hipervnculo"/>
@@ -2120,7 +2120,7 @@
             <w:noProof/>
             <w:webHidden/>
           </w:rPr>
-          <w:instrText xml:space="preserve"> PAGEREF _Toc244354672 \h </w:instrText>
+          <w:instrText xml:space="preserve"> PAGEREF _Toc244354979 \h </w:instrText>
         </w:r>
         <w:r>
           <w:rPr>
@@ -2166,7 +2166,7 @@
           <w14:ligatures w14:val="standardContextual"/>
         </w:rPr>
       </w:pPr>
-      <w:hyperlink w:anchor="_Toc244354673" w:history="1">
+      <w:hyperlink w:anchor="_Toc244354980" w:history="1">
         <w:r>
           <w:rPr>
             <w:rStyle w:val="Hipervnculo"/>
@@ -2193,7 +2193,7 @@
             <w:noProof/>
             <w:webHidden/>
           </w:rPr>
-          <w:instrText xml:space="preserve"> PAGEREF _Toc244354673 \h </w:instrText>
+          <w:instrText xml:space="preserve"> PAGEREF _Toc244354980 \h </w:instrText>
         </w:r>
         <w:r>
           <w:rPr>
@@ -2239,7 +2239,7 @@
           <w14:ligatures w14:val="standardContextual"/>
         </w:rPr>
       </w:pPr>
-      <w:hyperlink w:anchor="_Toc244354674" w:history="1">
+      <w:hyperlink w:anchor="_Toc244354981" w:history="1">
         <w:r>
           <w:rPr>
             <w:rStyle w:val="Hipervnculo"/>
@@ -2266,7 +2266,7 @@
             <w:noProof/>
             <w:webHidden/>
           </w:rPr>
-          <w:instrText xml:space="preserve"> PAGEREF _Toc244354674 \h </w:instrText>
+          <w:instrText xml:space="preserve"> PAGEREF _Toc244354981 \h </w:instrText>
         </w:r>
         <w:r>
           <w:rPr>
@@ -2312,7 +2312,7 @@
           <w14:ligatures w14:val="standardContextual"/>
         </w:rPr>
       </w:pPr>
-      <w:hyperlink w:anchor="_Toc244354675" w:history="1">
+      <w:hyperlink w:anchor="_Toc244354982" w:history="1">
         <w:r>
           <w:rPr>
             <w:rStyle w:val="Hipervnculo"/>
@@ -2339,7 +2339,7 @@
             <w:noProof/>
             <w:webHidden/>
           </w:rPr>
-          <w:instrText xml:space="preserve"> PAGEREF _Toc244354675 \h </w:instrText>
+          <w:instrText xml:space="preserve"> PAGEREF _Toc244354982 \h </w:instrText>
         </w:r>
         <w:r>
           <w:rPr>
@@ -2385,7 +2385,7 @@
           <w14:ligatures w14:val="standardContextual"/>
         </w:rPr>
       </w:pPr>
-      <w:hyperlink w:anchor="_Toc244354676" w:history="1">
+      <w:hyperlink w:anchor="_Toc244354983" w:history="1">
         <w:r>
           <w:rPr>
             <w:rStyle w:val="Hipervnculo"/>
@@ -2412,7 +2412,7 @@
             <w:noProof/>
             <w:webHidden/>
           </w:rPr>
-          <w:instrText xml:space="preserve"> PAGEREF _Toc244354676 \h </w:instrText>
+          <w:instrText xml:space="preserve"> PAGEREF _Toc244354983 \h </w:instrText>
         </w:r>
         <w:r>
           <w:rPr>
@@ -2458,7 +2458,7 @@
           <w14:ligatures w14:val="standardContextual"/>
         </w:rPr>
       </w:pPr>
-      <w:hyperlink w:anchor="_Toc244354677" w:history="1">
+      <w:hyperlink w:anchor="_Toc244354984" w:history="1">
         <w:r>
           <w:rPr>
             <w:rStyle w:val="Hipervnculo"/>
@@ -2485,7 +2485,7 @@
             <w:noProof/>
             <w:webHidden/>
           </w:rPr>
-          <w:instrText xml:space="preserve"> PAGEREF _Toc244354677 \h </w:instrText>
+          <w:instrText xml:space="preserve"> PAGEREF _Toc244354984 \h </w:instrText>
         </w:r>
         <w:r>
           <w:rPr>
@@ -2531,7 +2531,7 @@
           <w14:ligatures w14:val="standardContextual"/>
         </w:rPr>
       </w:pPr>
-      <w:hyperlink w:anchor="_Toc244354678" w:history="1">
+      <w:hyperlink w:anchor="_Toc244354985" w:history="1">
         <w:r>
           <w:rPr>
             <w:rStyle w:val="Hipervnculo"/>
@@ -2558,7 +2558,7 @@
             <w:noProof/>
             <w:webHidden/>
           </w:rPr>
-          <w:instrText xml:space="preserve"> PAGEREF _Toc244354678 \h </w:instrText>
+          <w:instrText xml:space="preserve"> PAGEREF _Toc244354985 \h </w:instrText>
         </w:r>
         <w:r>
           <w:rPr>
@@ -2604,7 +2604,7 @@
           <w14:ligatures w14:val="standardContextual"/>
         </w:rPr>
       </w:pPr>
-      <w:hyperlink w:anchor="_Toc244354679" w:history="1">
+      <w:hyperlink w:anchor="_Toc244354986" w:history="1">
         <w:r>
           <w:rPr>
             <w:rStyle w:val="Hipervnculo"/>
@@ -2631,7 +2631,7 @@
             <w:noProof/>
             <w:webHidden/>
           </w:rPr>
-          <w:instrText xml:space="preserve"> PAGEREF _Toc244354679 \h </w:instrText>
+          <w:instrText xml:space="preserve"> PAGEREF _Toc244354986 \h </w:instrText>
         </w:r>
         <w:r>
           <w:rPr>
@@ -2684,7 +2684,7 @@
           <w:szCs w:val="24"/>
         </w:rPr>
       </w:pPr>
-      <w:bookmarkStart w:id="0" w:name="_Toc244354649"/>
+      <w:bookmarkStart w:id="0" w:name="_Toc244354956"/>
       <w:r>
         <w:lastRenderedPageBreak/>
         <w:t>1. Introducción</w:t>
@@ -2760,7 +2760,7 @@
           <w:rFonts w:ascii="Arial" w:eastAsia="Arial" w:hAnsi="Arial" w:cs="Arial"/>
         </w:rPr>
       </w:pPr>
-      <w:bookmarkStart w:id="1" w:name="_Toc244354650"/>
+      <w:bookmarkStart w:id="1" w:name="_Toc244354957"/>
       <w:r>
         <w:t>2. Problema de investigación</w:t>
       </w:r>
@@ -2776,7 +2776,7 @@
           <w:rFonts w:ascii="Arial" w:eastAsia="Arial" w:hAnsi="Arial" w:cs="Arial"/>
         </w:rPr>
       </w:pPr>
-      <w:bookmarkStart w:id="2" w:name="_Toc244354651"/>
+      <w:bookmarkStart w:id="2" w:name="_Toc244354958"/>
       <w:r>
         <w:t>2.1 Planteamiento del problema</w:t>
       </w:r>
@@ -2834,7 +2834,7 @@
           <w:rFonts w:ascii="Arial" w:eastAsia="Arial" w:hAnsi="Arial" w:cs="Arial"/>
         </w:rPr>
       </w:pPr>
-      <w:bookmarkStart w:id="3" w:name="_Toc244354652"/>
+      <w:bookmarkStart w:id="3" w:name="_Toc244354959"/>
       <w:r>
         <w:lastRenderedPageBreak/>
         <w:t>2.2 Justificación del estudio</w:t>
@@ -2882,7 +2882,7 @@
           <w:szCs w:val="24"/>
         </w:rPr>
       </w:pPr>
-      <w:bookmarkStart w:id="4" w:name="_Toc244354653"/>
+      <w:bookmarkStart w:id="4" w:name="_Toc244354960"/>
       <w:r>
         <w:t>3. Marco Conceptual y Antecedentes</w:t>
       </w:r>
@@ -2897,7 +2897,7 @@
           <w:rFonts w:ascii="Arial" w:eastAsia="Arial" w:hAnsi="Arial" w:cs="Arial"/>
         </w:rPr>
       </w:pPr>
-      <w:bookmarkStart w:id="5" w:name="_Toc244354654"/>
+      <w:bookmarkStart w:id="5" w:name="_Toc244354961"/>
       <w:r>
         <w:t>3.1 Marco Conceptual</w:t>
       </w:r>
@@ -3019,7 +3019,7 @@
           <w:rFonts w:ascii="Arial" w:eastAsia="Arial" w:hAnsi="Arial" w:cs="Arial"/>
         </w:rPr>
       </w:pPr>
-      <w:bookmarkStart w:id="6" w:name="_Toc244354655"/>
+      <w:bookmarkStart w:id="6" w:name="_Toc244354962"/>
       <w:r>
         <w:t>3.2 Antecedentes</w:t>
       </w:r>
@@ -3271,7 +3271,7 @@
           <w:rFonts w:ascii="Arial" w:eastAsia="Arial" w:hAnsi="Arial" w:cs="Arial"/>
         </w:rPr>
       </w:pPr>
-      <w:bookmarkStart w:id="7" w:name="_Toc244354656"/>
+      <w:bookmarkStart w:id="7" w:name="_Toc244354963"/>
       <w:r>
         <w:t>4. Hipótesis</w:t>
       </w:r>
@@ -3329,7 +3329,7 @@
           <w:szCs w:val="24"/>
         </w:rPr>
       </w:pPr>
-      <w:bookmarkStart w:id="8" w:name="_Toc244354657"/>
+      <w:bookmarkStart w:id="8" w:name="_Toc244354964"/>
       <w:r>
         <w:lastRenderedPageBreak/>
         <w:t>5. Variables</w:t>
@@ -7175,7 +7175,7 @@
           <w:szCs w:val="24"/>
         </w:rPr>
       </w:pPr>
-      <w:bookmarkStart w:id="9" w:name="_Toc244354658"/>
+      <w:bookmarkStart w:id="9" w:name="_Toc244354965"/>
       <w:r>
         <w:t>6. Objetivos</w:t>
       </w:r>
@@ -7190,7 +7190,7 @@
           <w:rFonts w:ascii="Arial" w:eastAsia="Arial" w:hAnsi="Arial" w:cs="Arial"/>
         </w:rPr>
       </w:pPr>
-      <w:bookmarkStart w:id="10" w:name="_Toc244354659"/>
+      <w:bookmarkStart w:id="10" w:name="_Toc244354966"/>
       <w:r>
         <w:t>6.1 Objetivo General</w:t>
       </w:r>
@@ -7218,7 +7218,7 @@
           <w:rFonts w:ascii="Arial" w:eastAsia="Arial" w:hAnsi="Arial" w:cs="Arial"/>
         </w:rPr>
       </w:pPr>
-      <w:bookmarkStart w:id="11" w:name="_Toc244354660"/>
+      <w:bookmarkStart w:id="11" w:name="_Toc244354967"/>
       <w:r>
         <w:t>6.2 Objetivos Específicos</w:t>
       </w:r>
@@ -7285,7 +7285,7 @@
           <w:szCs w:val="24"/>
         </w:rPr>
       </w:pPr>
-      <w:bookmarkStart w:id="12" w:name="_Toc244354661"/>
+      <w:bookmarkStart w:id="12" w:name="_Toc244354968"/>
       <w:r>
         <w:lastRenderedPageBreak/>
         <w:t>7. Alcances del trabajo y limitaciones</w:t>
@@ -7361,7 +7361,7 @@
           <w:szCs w:val="24"/>
         </w:rPr>
       </w:pPr>
-      <w:bookmarkStart w:id="13" w:name="_Toc244354662"/>
+      <w:bookmarkStart w:id="13" w:name="_Toc244354969"/>
       <w:r>
         <w:t>8. Metodología</w:t>
       </w:r>
@@ -7377,7 +7377,7 @@
           <w:rFonts w:ascii="Arial" w:eastAsia="Arial" w:hAnsi="Arial" w:cs="Arial"/>
         </w:rPr>
       </w:pPr>
-      <w:bookmarkStart w:id="14" w:name="_Toc244354663"/>
+      <w:bookmarkStart w:id="14" w:name="_Toc244354970"/>
       <w:r>
         <w:t>8.1 Diseño metodológico</w:t>
       </w:r>
@@ -7407,7 +7407,7 @@
           <w:szCs w:val="22"/>
         </w:rPr>
       </w:pPr>
-      <w:bookmarkStart w:id="15" w:name="_Toc244354664"/>
+      <w:bookmarkStart w:id="15" w:name="_Toc244354971"/>
       <w:r>
         <w:t>8.2 Datos</w:t>
       </w:r>
@@ -7449,7 +7449,7 @@
           <w:szCs w:val="22"/>
         </w:rPr>
       </w:pPr>
-      <w:bookmarkStart w:id="16" w:name="_Toc244354665"/>
+      <w:bookmarkStart w:id="16" w:name="_Toc244354972"/>
       <w:r>
         <w:t>8.3 Técnicas</w:t>
       </w:r>
@@ -7479,7 +7479,7 @@
           <w:szCs w:val="22"/>
         </w:rPr>
       </w:pPr>
-      <w:bookmarkStart w:id="17" w:name="_Toc244354666"/>
+      <w:bookmarkStart w:id="17" w:name="_Toc244354973"/>
       <w:r>
         <w:t>8.4 Herramientas</w:t>
       </w:r>
@@ -7537,7 +7537,7 @@
         <w:pageBreakBefore/>
         <w:spacing w:before="200"/>
       </w:pPr>
-      <w:bookmarkStart w:id="18" w:name="_Toc244354667"/>
+      <w:bookmarkStart w:id="18" w:name="_Toc244354974"/>
       <w:r>
         <w:lastRenderedPageBreak/>
         <w:t>9. Desarrollo</w:t>
@@ -7550,7 +7550,7 @@
         <w:keepLines/>
         <w:spacing w:before="200"/>
       </w:pPr>
-      <w:bookmarkStart w:id="19" w:name="_Toc244354668"/>
+      <w:bookmarkStart w:id="19" w:name="_Toc244354975"/>
       <w:r>
         <w:t>9.1 Descripción de los datos</w:t>
       </w:r>
@@ -11792,7 +11792,7 @@
         <w:keepLines/>
         <w:spacing w:before="200"/>
       </w:pPr>
-      <w:bookmarkStart w:id="20" w:name="_Toc244354669"/>
+      <w:bookmarkStart w:id="20" w:name="_Toc244354976"/>
       <w:r>
         <w:t>9.2 Preparación de los datos</w:t>
       </w:r>
@@ -15181,7 +15181,7 @@
         <w:keepLines/>
         <w:spacing w:before="200"/>
       </w:pPr>
-      <w:bookmarkStart w:id="21" w:name="_Toc244354670"/>
+      <w:bookmarkStart w:id="21" w:name="_Toc244354977"/>
       <w:r>
         <w:t>9.3 Análisis Exploratorio de Datos (EDA)</w:t>
       </w:r>
@@ -19236,7 +19236,7 @@
         <w:keepLines/>
         <w:spacing w:before="200"/>
       </w:pPr>
-      <w:bookmarkStart w:id="22" w:name="_Toc244354671"/>
+      <w:bookmarkStart w:id="22" w:name="_Toc244354978"/>
       <w:r>
         <w:lastRenderedPageBreak/>
         <w:t>9.4 Desarrollo de los modelos predictivos</w:t>
@@ -20046,7 +20046,7 @@
         <w:keepLines/>
         <w:spacing w:before="200"/>
       </w:pPr>
-      <w:bookmarkStart w:id="23" w:name="_Toc244354672"/>
+      <w:bookmarkStart w:id="23" w:name="_Toc244354979"/>
       <w:r>
         <w:t>9.5 Desarrollo y evaluación del modelo</w:t>
       </w:r>
@@ -23765,7 +23765,7 @@
         <w:keepLines/>
         <w:spacing w:before="200"/>
       </w:pPr>
-      <w:bookmarkStart w:id="24" w:name="_Toc244354673"/>
+      <w:bookmarkStart w:id="24" w:name="_Toc244354980"/>
       <w:r>
         <w:t>10. Conclusiones</w:t>
       </w:r>
@@ -24225,20 +24225,7 @@
           <w:rFonts w:ascii="Times New Roman" w:hAnsi="Times New Roman"/>
           <w:sz w:val="24"/>
         </w:rPr>
-        <w:t>La interpretación quedó condicionada por la calidad y cobertura de los avisos, la concentración en Centro y una evaluación aleatoria dentro de la misma fuente, y el error fue mayor en los precios altos.</w:t>
-      </w:r>
-    </w:p>
-    <w:p>
-      <w:pPr>
-        <w:spacing w:after="120" w:line="360" w:lineRule="auto"/>
-        <w:jc w:val="both"/>
-      </w:pPr>
-      <w:r>
-        <w:rPr>
-          <w:rFonts w:ascii="Times New Roman" w:hAnsi="Times New Roman"/>
-          <w:sz w:val="24"/>
-        </w:rPr>
-        <w:t>Se propone revisar las extracciones de texto, evaluar la sensibilidad de los rangos y la imputación, ampliar barrios con pocos casos y realizar validaciones temporales o por grupos de inmuebles, además de mejorar la trazabilidad de las capturas y la procedencia de la cartografía.</w:t>
+        <w:t>Los modelos permitieron estimar el precio publicado de los departamentos analizados, con mejores resultados en los segmentos de precios bajos y medios. Como continuidad del trabajo, se propone ampliar la representación de los barrios con pocos avisos y evaluar el desempeño con publicaciones de otros períodos.</w:t>
       </w:r>
     </w:p>
     <w:p>
@@ -24248,7 +24235,7 @@
         <w:pageBreakBefore/>
         <w:spacing w:before="200"/>
       </w:pPr>
-      <w:bookmarkStart w:id="25" w:name="_Toc244354674"/>
+      <w:bookmarkStart w:id="25" w:name="_Toc244354981"/>
       <w:r>
         <w:lastRenderedPageBreak/>
         <w:t>11. Referencias bibliográficas</w:t>
@@ -24679,7 +24666,7 @@
         <w:pageBreakBefore/>
         <w:spacing w:before="200"/>
       </w:pPr>
-      <w:bookmarkStart w:id="26" w:name="_Toc244354675"/>
+      <w:bookmarkStart w:id="26" w:name="_Toc244354982"/>
       <w:r>
         <w:lastRenderedPageBreak/>
         <w:t>12. Anexos</w:t>
@@ -24692,7 +24679,7 @@
         <w:keepLines/>
         <w:spacing w:before="200"/>
       </w:pPr>
-      <w:bookmarkStart w:id="27" w:name="_Toc244354676"/>
+      <w:bookmarkStart w:id="27" w:name="_Toc244354983"/>
       <w:r>
         <w:t>12.1 Anexo A Clasificación bibliográfica utilizada en el estado del arte</w:t>
       </w:r>
@@ -24744,7 +24731,7 @@
         <w:keepLines/>
         <w:spacing w:before="200"/>
       </w:pPr>
-      <w:bookmarkStart w:id="28" w:name="_Toc244354677"/>
+      <w:bookmarkStart w:id="28" w:name="_Toc244354984"/>
       <w:r>
         <w:t>12.2 Correspondencia entre el notebook y el desarrollo</w:t>
       </w:r>
@@ -25543,7 +25530,7 @@
         <w:keepLines/>
         <w:spacing w:before="240"/>
       </w:pPr>
-      <w:bookmarkStart w:id="29" w:name="_Toc244354678"/>
+      <w:bookmarkStart w:id="29" w:name="_Toc244354985"/>
       <w:r>
         <w:t>12.3 Evidencia gráfica complementaria</w:t>
       </w:r>
@@ -26380,7 +26367,7 @@
         <w:keepLines/>
         <w:spacing w:before="200"/>
       </w:pPr>
-      <w:bookmarkStart w:id="30" w:name="_Toc244354679"/>
+      <w:bookmarkStart w:id="30" w:name="_Toc244354986"/>
       <w:r>
         <w:t>12.4 Archivos de respaldo y reproducibilidad</w:t>
       </w:r>
@@ -26533,12 +26520,12 @@
             <w:pPr>
               <w:spacing w:before="60" w:after="60" w:line="264" w:lineRule="auto"/>
             </w:pPr>
-            <w:hyperlink r:id="rId40">
+            <w:hyperlink r:id="rId36">
               <w:r>
                 <w:rPr>
                   <w:rFonts w:ascii="Times New Roman" w:hAnsi="Times New Roman"/>
+                  <w:color w:val="0563C1"/>
                   <w:sz w:val="21"/>
-                  <w:color w:val="0563C1"/>
                   <w:u w:val="single"/>
                 </w:rPr>
                 <w:t>DATA_MODELING/01_EDA.ipynb</w:t>
@@ -26600,12 +26587,12 @@
             <w:pPr>
               <w:spacing w:before="60" w:after="60" w:line="264" w:lineRule="auto"/>
             </w:pPr>
-            <w:hyperlink r:id="rId41">
+            <w:hyperlink r:id="rId37">
               <w:r>
                 <w:rPr>
                   <w:rFonts w:ascii="Times New Roman" w:hAnsi="Times New Roman"/>
+                  <w:color w:val="0563C1"/>
                   <w:sz w:val="21"/>
-                  <w:color w:val="0563C1"/>
                   <w:u w:val="single"/>
                 </w:rPr>
                 <w:t>data/mitula_venta_mar_del_plata_SC.xlsx</w:t>
@@ -26667,12 +26654,12 @@
             <w:pPr>
               <w:spacing w:before="60" w:after="60" w:line="264" w:lineRule="auto"/>
             </w:pPr>
-            <w:hyperlink r:id="rId42">
+            <w:hyperlink r:id="rId38">
               <w:r>
                 <w:rPr>
                   <w:rFonts w:ascii="Times New Roman" w:hAnsi="Times New Roman"/>
+                  <w:color w:val="0563C1"/>
                   <w:sz w:val="21"/>
-                  <w:color w:val="0563C1"/>
                   <w:u w:val="single"/>
                 </w:rPr>
                 <w:t>data/correcciones_avisos.json</w:t>
@@ -26734,12 +26721,12 @@
             <w:pPr>
               <w:spacing w:before="60" w:after="60" w:line="264" w:lineRule="auto"/>
             </w:pPr>
-            <w:hyperlink r:id="rId43">
+            <w:hyperlink r:id="rId39">
               <w:r>
                 <w:rPr>
                   <w:rFonts w:ascii="Times New Roman" w:hAnsi="Times New Roman"/>
+                  <w:color w:val="0563C1"/>
                   <w:sz w:val="21"/>
-                  <w:color w:val="0563C1"/>
                   <w:u w:val="single"/>
                 </w:rPr>
                 <w:t>data/barrios_mar_del_plata.geojson</w:t>
@@ -26801,12 +26788,12 @@
             <w:pPr>
               <w:spacing w:before="60" w:after="60" w:line="264" w:lineRule="auto"/>
             </w:pPr>
-            <w:hyperlink r:id="rId44">
+            <w:hyperlink r:id="rId40">
               <w:r>
                 <w:rPr>
                   <w:rFonts w:ascii="Times New Roman" w:hAnsi="Times New Roman"/>
+                  <w:color w:val="0563C1"/>
                   <w:sz w:val="21"/>
-                  <w:color w:val="0563C1"/>
                   <w:u w:val="single"/>
                 </w:rPr>
                 <w:t>data/costa_mar_del_plata.geojson</w:t>
@@ -26868,12 +26855,12 @@
             <w:pPr>
               <w:spacing w:before="60" w:after="60" w:line="264" w:lineRule="auto"/>
             </w:pPr>
-            <w:hyperlink r:id="rId45">
+            <w:hyperlink r:id="rId41">
               <w:r>
                 <w:rPr>
                   <w:rFonts w:ascii="Times New Roman" w:hAnsi="Times New Roman"/>
+                  <w:color w:val="0563C1"/>
                   <w:sz w:val="21"/>
-                  <w:color w:val="0563C1"/>
                   <w:u w:val="single"/>
                 </w:rPr>
                 <w:t>data/mitula_departamentos_final.xlsx</w:t>
@@ -26935,12 +26922,12 @@
             <w:pPr>
               <w:spacing w:before="60" w:after="60" w:line="264" w:lineRule="auto"/>
             </w:pPr>
-            <w:hyperlink r:id="rId46">
+            <w:hyperlink r:id="rId42">
               <w:r>
                 <w:rPr>
                   <w:rFonts w:ascii="Times New Roman" w:hAnsi="Times New Roman"/>
+                  <w:color w:val="0563C1"/>
                   <w:sz w:val="21"/>
-                  <w:color w:val="0563C1"/>
                   <w:u w:val="single"/>
                 </w:rPr>
                 <w:t>DATA_MODELING/pycaret_complementario.py</w:t>
@@ -27002,12 +26989,12 @@
             <w:pPr>
               <w:spacing w:before="60" w:after="60" w:line="264" w:lineRule="auto"/>
             </w:pPr>
-            <w:hyperlink r:id="rId47">
+            <w:hyperlink r:id="rId43">
               <w:r>
                 <w:rPr>
                   <w:rFonts w:ascii="Times New Roman" w:hAnsi="Times New Roman"/>
+                  <w:color w:val="0563C1"/>
                   <w:sz w:val="21"/>
-                  <w:color w:val="0563C1"/>
                   <w:u w:val="single"/>
                 </w:rPr>
                 <w:t>DATA_MODELING/reportes/pycaret</w:t>
@@ -27048,8 +27035,8 @@
     </w:tbl>
     <w:p/>
     <w:sectPr>
-      <w:headerReference w:type="default" r:id="rId36"/>
-      <w:footerReference w:type="default" r:id="rId37"/>
+      <w:headerReference w:type="default" r:id="rId44"/>
+      <w:footerReference w:type="default" r:id="rId45"/>
       <w:pgSz w:w="11906" w:h="16838"/>
       <w:pgMar w:top="1134" w:right="1134" w:bottom="1134" w:left="1134" w:header="708" w:footer="708" w:gutter="0"/>
       <w:pgNumType w:start="1"/>

</xml_diff>

<commit_message>
Resume tabla de anexos a materiales principales
</commit_message>
<xml_diff>
--- a/entregables/TFI_departamentos_final_anexos.docx
+++ b/entregables/TFI_departamentos_final_anexos.docx
@@ -26626,207 +26626,6 @@
                 <w:sz w:val="21"/>
               </w:rPr>
               <w:t>Base de entrada y hojas Ejecucion y Cobertura.</w:t>
-            </w:r>
-          </w:p>
-        </w:tc>
-      </w:tr>
-      <w:tr>
-        <w:trPr>
-          <w:cantSplit/>
-        </w:trPr>
-        <w:tc>
-          <w:tcPr>
-            <w:tcW w:w="2835" w:type="dxa"/>
-            <w:tcBorders>
-              <w:top w:val="single" w:sz="4" w:space="0" w:color="D9D9D9"/>
-              <w:left w:val="single" w:sz="4" w:space="0" w:color="D9D9D9"/>
-              <w:bottom w:val="single" w:sz="4" w:space="0" w:color="D9D9D9"/>
-              <w:right w:val="single" w:sz="4" w:space="0" w:color="D9D9D9"/>
-            </w:tcBorders>
-            <w:tcMar>
-              <w:top w:w="85" w:type="dxa"/>
-              <w:left w:w="85" w:type="dxa"/>
-              <w:bottom w:w="85" w:type="dxa"/>
-              <w:right w:w="85" w:type="dxa"/>
-            </w:tcMar>
-          </w:tcPr>
-          <w:p>
-            <w:pPr>
-              <w:spacing w:before="60" w:after="60" w:line="264" w:lineRule="auto"/>
-            </w:pPr>
-            <w:hyperlink r:id="rId38">
-              <w:r>
-                <w:rPr>
-                  <w:rFonts w:ascii="Times New Roman" w:hAnsi="Times New Roman"/>
-                  <w:color w:val="0563C1"/>
-                  <w:sz w:val="21"/>
-                  <w:u w:val="single"/>
-                </w:rPr>
-                <w:t>data/correcciones_avisos.json</w:t>
-              </w:r>
-            </w:hyperlink>
-          </w:p>
-        </w:tc>
-        <w:tc>
-          <w:tcPr>
-            <w:tcW w:w="6803" w:type="dxa"/>
-            <w:tcBorders>
-              <w:top w:val="single" w:sz="4" w:space="0" w:color="D9D9D9"/>
-              <w:left w:val="single" w:sz="4" w:space="0" w:color="D9D9D9"/>
-              <w:bottom w:val="single" w:sz="4" w:space="0" w:color="D9D9D9"/>
-              <w:right w:val="single" w:sz="4" w:space="0" w:color="D9D9D9"/>
-            </w:tcBorders>
-            <w:tcMar>
-              <w:top w:w="85" w:type="dxa"/>
-              <w:left w:w="85" w:type="dxa"/>
-              <w:bottom w:w="85" w:type="dxa"/>
-              <w:right w:w="85" w:type="dxa"/>
-            </w:tcMar>
-          </w:tcPr>
-          <w:p>
-            <w:pPr>
-              <w:spacing w:before="60" w:after="60" w:line="264" w:lineRule="auto"/>
-            </w:pPr>
-            <w:r>
-              <w:rPr>
-                <w:rFonts w:ascii="Times New Roman" w:hAnsi="Times New Roman"/>
-                <w:sz w:val="21"/>
-              </w:rPr>
-              <w:t>Exclusión y correcciones manuales con motivos y fuentes.</w:t>
-            </w:r>
-          </w:p>
-        </w:tc>
-      </w:tr>
-      <w:tr>
-        <w:trPr>
-          <w:cantSplit/>
-        </w:trPr>
-        <w:tc>
-          <w:tcPr>
-            <w:tcW w:w="2835" w:type="dxa"/>
-            <w:tcBorders>
-              <w:top w:val="single" w:sz="4" w:space="0" w:color="D9D9D9"/>
-              <w:left w:val="single" w:sz="4" w:space="0" w:color="D9D9D9"/>
-              <w:bottom w:val="single" w:sz="4" w:space="0" w:color="D9D9D9"/>
-              <w:right w:val="single" w:sz="4" w:space="0" w:color="D9D9D9"/>
-            </w:tcBorders>
-            <w:tcMar>
-              <w:top w:w="85" w:type="dxa"/>
-              <w:left w:w="85" w:type="dxa"/>
-              <w:bottom w:w="85" w:type="dxa"/>
-              <w:right w:w="85" w:type="dxa"/>
-            </w:tcMar>
-          </w:tcPr>
-          <w:p>
-            <w:pPr>
-              <w:spacing w:before="60" w:after="60" w:line="264" w:lineRule="auto"/>
-            </w:pPr>
-            <w:hyperlink r:id="rId39">
-              <w:r>
-                <w:rPr>
-                  <w:rFonts w:ascii="Times New Roman" w:hAnsi="Times New Roman"/>
-                  <w:color w:val="0563C1"/>
-                  <w:sz w:val="21"/>
-                  <w:u w:val="single"/>
-                </w:rPr>
-                <w:t>data/barrios_mar_del_plata.geojson</w:t>
-              </w:r>
-            </w:hyperlink>
-          </w:p>
-        </w:tc>
-        <w:tc>
-          <w:tcPr>
-            <w:tcW w:w="6803" w:type="dxa"/>
-            <w:tcBorders>
-              <w:top w:val="single" w:sz="4" w:space="0" w:color="D9D9D9"/>
-              <w:left w:val="single" w:sz="4" w:space="0" w:color="D9D9D9"/>
-              <w:bottom w:val="single" w:sz="4" w:space="0" w:color="D9D9D9"/>
-              <w:right w:val="single" w:sz="4" w:space="0" w:color="D9D9D9"/>
-            </w:tcBorders>
-            <w:tcMar>
-              <w:top w:w="85" w:type="dxa"/>
-              <w:left w:w="85" w:type="dxa"/>
-              <w:bottom w:w="85" w:type="dxa"/>
-              <w:right w:w="85" w:type="dxa"/>
-            </w:tcMar>
-          </w:tcPr>
-          <w:p>
-            <w:pPr>
-              <w:spacing w:before="60" w:after="60" w:line="264" w:lineRule="auto"/>
-            </w:pPr>
-            <w:r>
-              <w:rPr>
-                <w:rFonts w:ascii="Times New Roman" w:hAnsi="Times New Roman"/>
-                <w:sz w:val="21"/>
-              </w:rPr>
-              <w:t>Polígonos utilizados para asignar barrios.</w:t>
-            </w:r>
-          </w:p>
-        </w:tc>
-      </w:tr>
-      <w:tr>
-        <w:trPr>
-          <w:cantSplit/>
-        </w:trPr>
-        <w:tc>
-          <w:tcPr>
-            <w:tcW w:w="2835" w:type="dxa"/>
-            <w:tcBorders>
-              <w:top w:val="single" w:sz="4" w:space="0" w:color="D9D9D9"/>
-              <w:left w:val="single" w:sz="4" w:space="0" w:color="D9D9D9"/>
-              <w:bottom w:val="single" w:sz="4" w:space="0" w:color="D9D9D9"/>
-              <w:right w:val="single" w:sz="4" w:space="0" w:color="D9D9D9"/>
-            </w:tcBorders>
-            <w:tcMar>
-              <w:top w:w="85" w:type="dxa"/>
-              <w:left w:w="85" w:type="dxa"/>
-              <w:bottom w:w="85" w:type="dxa"/>
-              <w:right w:w="85" w:type="dxa"/>
-            </w:tcMar>
-          </w:tcPr>
-          <w:p>
-            <w:pPr>
-              <w:spacing w:before="60" w:after="60" w:line="264" w:lineRule="auto"/>
-            </w:pPr>
-            <w:hyperlink r:id="rId40">
-              <w:r>
-                <w:rPr>
-                  <w:rFonts w:ascii="Times New Roman" w:hAnsi="Times New Roman"/>
-                  <w:color w:val="0563C1"/>
-                  <w:sz w:val="21"/>
-                  <w:u w:val="single"/>
-                </w:rPr>
-                <w:t>data/costa_mar_del_plata.geojson</w:t>
-              </w:r>
-            </w:hyperlink>
-          </w:p>
-        </w:tc>
-        <w:tc>
-          <w:tcPr>
-            <w:tcW w:w="6803" w:type="dxa"/>
-            <w:tcBorders>
-              <w:top w:val="single" w:sz="4" w:space="0" w:color="D9D9D9"/>
-              <w:left w:val="single" w:sz="4" w:space="0" w:color="D9D9D9"/>
-              <w:bottom w:val="single" w:sz="4" w:space="0" w:color="D9D9D9"/>
-              <w:right w:val="single" w:sz="4" w:space="0" w:color="D9D9D9"/>
-            </w:tcBorders>
-            <w:tcMar>
-              <w:top w:w="85" w:type="dxa"/>
-              <w:left w:w="85" w:type="dxa"/>
-              <w:bottom w:w="85" w:type="dxa"/>
-              <w:right w:w="85" w:type="dxa"/>
-            </w:tcMar>
-          </w:tcPr>
-          <w:p>
-            <w:pPr>
-              <w:spacing w:before="60" w:after="60" w:line="264" w:lineRule="auto"/>
-            </w:pPr>
-            <w:r>
-              <w:rPr>
-                <w:rFonts w:ascii="Times New Roman" w:hAnsi="Times New Roman"/>
-                <w:sz w:val="21"/>
-              </w:rPr>
-              <w:t>Geometría de costa para calcular distancia al mar.</w:t>
             </w:r>
           </w:p>
         </w:tc>

</xml_diff>